<commit_message>
MVP 0.1 almost there. Manunal test flow working
</commit_message>
<xml_diff>
--- a/apps/portal/public/submittal-template.docx
+++ b/apps/portal/public/submittal-template.docx
@@ -69,12 +69,22 @@
     </w:p>
     <w:p>
       <w:r>
-        <w:t xml:space="preserve">{{candidate_seniority}}</w:t>
-      </w:r>
-    </w:p>
-    <w:p>
-      <w:r>
-        <w:t xml:space="preserve">{{candidate_titles}}</w:t>
+        <w:t xml:space="preserve">{{#show_current_title}}Current Title: {{current_title}}{{/show_current_title}}</w:t>
+      </w:r>
+    </w:p>
+    <w:p>
+      <w:r>
+        <w:t xml:space="preserve">{{#show_candidate_location}}Location: {{candidate_location}}{{/show_candidate_location}}</w:t>
+      </w:r>
+    </w:p>
+    <w:p>
+      <w:r>
+        <w:t xml:space="preserve">{{#show_work_authorization}}Work Authorization: {{work_authorization}}{{/show_work_authorization}}</w:t>
+      </w:r>
+    </w:p>
+    <w:p>
+      <w:r>
+        <w:t xml:space="preserve">{{#show_total_experience}}Total Experience: {{total_experience}}{{/show_total_experience}}</w:t>
       </w:r>
     </w:p>
     <w:p>

</xml_diff>

<commit_message>
MVP 0.2 - Ready for prompt eval
</commit_message>
<xml_diff>
--- a/apps/portal/public/submittal-template.docx
+++ b/apps/portal/public/submittal-template.docx
@@ -126,6 +126,11 @@
       </w:r>
     </w:p>
     <w:p>
+      <w:r>
+        <w:t xml:space="preserve">{{#show_key_qualifications}}</w:t>
+      </w:r>
+    </w:p>
+    <w:p>
       <w:pPr>
         <w:spacing w:before="240"/>
       </w:pPr>
@@ -156,6 +161,11 @@
       </w:r>
     </w:p>
     <w:p>
+      <w:r>
+        <w:t xml:space="preserve">{{/show_key_qualifications}}</w:t>
+      </w:r>
+    </w:p>
+    <w:p>
       <w:pPr>
         <w:spacing w:before="240"/>
       </w:pPr>
@@ -204,7 +214,20 @@
     </w:p>
     <w:p>
       <w:r>
-        <w:t xml:space="preserve">{{comp_logistics}}</w:t>
+        <w:t xml:space="preserve">{{#comp_logistics_items}}</w:t>
+      </w:r>
+    </w:p>
+    <w:p>
+      <w:pPr>
+        <w:ind w:left="360" w:hanging="360"/>
+      </w:pPr>
+      <w:r>
+        <w:t xml:space="preserve">•	{{text}}</w:t>
+      </w:r>
+    </w:p>
+    <w:p>
+      <w:r>
+        <w:t xml:space="preserve">{{/comp_logistics_items}}</w:t>
       </w:r>
     </w:p>
     <w:p>
@@ -231,7 +254,20 @@
     </w:p>
     <w:p>
       <w:r>
-        <w:t xml:space="preserve">{{recruiter_notes}}</w:t>
+        <w:t xml:space="preserve">{{#recruiter_notes_items}}</w:t>
+      </w:r>
+    </w:p>
+    <w:p>
+      <w:pPr>
+        <w:ind w:left="360" w:hanging="360"/>
+      </w:pPr>
+      <w:r>
+        <w:t xml:space="preserve">•	{{text}}</w:t>
+      </w:r>
+    </w:p>
+    <w:p>
+      <w:r>
+        <w:t xml:space="preserve">{{/recruiter_notes_items}}</w:t>
       </w:r>
     </w:p>
     <w:p>

</xml_diff>